<commit_message>
Mise à jour de la piste de scores
</commit_message>
<xml_diff>
--- a/pictures/Piste-Scores/Piste-de-Scores.docx
+++ b/pictures/Piste-Scores/Piste-de-Scores.docx
@@ -803,16 +803,10 @@
           <w:noProof/>
         </w:rPr>
         <w:drawing>
-          <wp:inline distT="0" distB="0" distL="0" distR="0" wp14:anchorId="76F745F9" wp14:editId="2D21FB81">
-            <wp:extent cx="7608467" cy="5078408"/>
-            <wp:effectExtent l="0" t="0" r="0" b="8255"/>
-            <wp:docPr id="231" name="Image 230" descr="Une image contenant capture d’écran, carré, Rectangle, jeu de plateau&#10;&#10;Le contenu généré par l’IA peut être incorrect.">
-              <a:extLst xmlns:a="http://schemas.openxmlformats.org/drawingml/2006/main">
-                <a:ext uri="{FF2B5EF4-FFF2-40B4-BE49-F238E27FC236}">
-                  <a16:creationId xmlns:a16="http://schemas.microsoft.com/office/drawing/2014/main" id="{BE3725EC-30AF-C744-5AB4-AABA6CB8A032}"/>
-                </a:ext>
-              </a:extLst>
-            </wp:docPr>
+          <wp:inline distT="0" distB="0" distL="0" distR="0" wp14:anchorId="583F8344" wp14:editId="12BA19DA">
+            <wp:extent cx="7927975" cy="5038090"/>
+            <wp:effectExtent l="0" t="0" r="0" b="0"/>
+            <wp:docPr id="533669781" name="Image 1"/>
             <wp:cNvGraphicFramePr>
               <a:graphicFrameLocks xmlns:a="http://schemas.openxmlformats.org/drawingml/2006/main" noChangeAspect="1"/>
             </wp:cNvGraphicFramePr>
@@ -820,31 +814,36 @@
               <a:graphicData uri="http://schemas.openxmlformats.org/drawingml/2006/picture">
                 <pic:pic xmlns:pic="http://schemas.openxmlformats.org/drawingml/2006/picture">
                   <pic:nvPicPr>
-                    <pic:cNvPr id="231" name="Image 230" descr="Une image contenant capture d’écran, carré, Rectangle, jeu de plateau&#10;&#10;Le contenu généré par l’IA peut être incorrect.">
-                      <a:extLst>
-                        <a:ext uri="{FF2B5EF4-FFF2-40B4-BE49-F238E27FC236}">
-                          <a16:creationId xmlns:a16="http://schemas.microsoft.com/office/drawing/2014/main" id="{BE3725EC-30AF-C744-5AB4-AABA6CB8A032}"/>
-                        </a:ext>
-                      </a:extLst>
-                    </pic:cNvPr>
+                    <pic:cNvPr id="0" name="Picture 1"/>
                     <pic:cNvPicPr>
-                      <a:picLocks noChangeAspect="1"/>
+                      <a:picLocks noChangeAspect="1" noChangeArrowheads="1"/>
                     </pic:cNvPicPr>
                   </pic:nvPicPr>
                   <pic:blipFill>
-                    <a:blip r:embed="rId41"/>
+                    <a:blip r:embed="rId41">
+                      <a:extLst>
+                        <a:ext uri="{28A0092B-C50C-407E-A947-70E740481C1C}">
+                          <a14:useLocalDpi xmlns:a14="http://schemas.microsoft.com/office/drawing/2010/main" val="0"/>
+                        </a:ext>
+                      </a:extLst>
+                    </a:blip>
+                    <a:srcRect/>
                     <a:stretch>
                       <a:fillRect/>
                     </a:stretch>
                   </pic:blipFill>
-                  <pic:spPr>
+                  <pic:spPr bwMode="auto">
                     <a:xfrm>
                       <a:off x="0" y="0"/>
-                      <a:ext cx="7608467" cy="5078408"/>
+                      <a:ext cx="7927975" cy="5038090"/>
                     </a:xfrm>
                     <a:prstGeom prst="rect">
                       <a:avLst/>
                     </a:prstGeom>
+                    <a:noFill/>
+                    <a:ln>
+                      <a:noFill/>
+                    </a:ln>
                   </pic:spPr>
                 </pic:pic>
               </a:graphicData>

</xml_diff>